<commit_message>
Update career history and organize strengths around marketing data and AI
</commit_message>
<xml_diff>
--- a/career/downloads/hayato-uchida-career-20261022.docx
+++ b/career/downloads/hayato-uchida-career-20261022.docx
@@ -255,458 +255,62 @@
       </w:r>
     </w:p>
     <w:p>
-      <w:pPr>
-        <w:widowControl w:val="0"/>
-        <w:numPr>
-          <w:ilvl w:val="0"/>
-          <w:numId w:val="8"/>
-        </w:numPr>
-        <w:spacing w:before="240" w:line="264" w:lineRule="auto"/>
-        <w:ind w:left="0" w:hanging="2"/>
-        <w:rPr>
-          <w:rFonts w:ascii="メイリオ" w:eastAsia="メイリオ" w:hAnsi="メイリオ" w:cs="メイリオ"/>
-          <w:sz w:val="21"/>
-          <w:szCs w:val="21"/>
-        </w:rPr>
-      </w:pPr>
-      <w:r>
-        <w:rPr>
-          <w:rFonts w:ascii="メイリオ" w:eastAsia="メイリオ" w:hAnsi="メイリオ" w:cs="メイリオ"/>
-          <w:b/>
-          <w:sz w:val="21"/>
-          <w:szCs w:val="21"/>
-        </w:rPr>
-        <w:t>データ・テクノロジーの理解と活用</w:t>
-      </w:r>
-      <w:r>
-        <w:rPr>
-          <w:rFonts w:ascii="メイリオ" w:eastAsia="メイリオ" w:hAnsi="メイリオ" w:cs="メイリオ"/>
-          <w:sz w:val="21"/>
-          <w:szCs w:val="21"/>
-        </w:rPr>
-        <w:t>：</w:t>
-      </w:r>
-    </w:p>
-    <w:p>
-      <w:pPr>
-        <w:widowControl w:val="0"/>
-        <w:numPr>
-          <w:ilvl w:val="2"/>
-          <w:numId w:val="8"/>
-        </w:numPr>
-        <w:spacing w:line="264" w:lineRule="auto"/>
-        <w:ind w:leftChars="0" w:firstLineChars="0"/>
-        <w:rPr>
-          <w:rFonts w:ascii="メイリオ" w:eastAsia="メイリオ" w:hAnsi="メイリオ" w:cs="メイリオ"/>
-          <w:sz w:val="21"/>
-          <w:szCs w:val="21"/>
-        </w:rPr>
-      </w:pPr>
-      <w:r>
-        <w:rPr>
-          <w:rFonts w:ascii="メイリオ" w:eastAsia="メイリオ" w:hAnsi="メイリオ" w:cs="メイリオ"/>
-          <w:sz w:val="21"/>
-          <w:szCs w:val="21"/>
-        </w:rPr>
-        <w:t>CDP、BI、MA、AI、ML、ChatGPTの技術に精通</w:t>
-      </w:r>
-    </w:p>
-    <w:p>
-      <w:pPr>
-        <w:widowControl w:val="0"/>
-        <w:numPr>
-          <w:ilvl w:val="2"/>
-          <w:numId w:val="8"/>
-        </w:numPr>
-        <w:spacing w:line="264" w:lineRule="auto"/>
-        <w:ind w:leftChars="0" w:firstLineChars="0"/>
-        <w:rPr>
-          <w:rFonts w:ascii="メイリオ" w:eastAsia="メイリオ" w:hAnsi="メイリオ" w:cs="メイリオ"/>
-          <w:sz w:val="21"/>
-          <w:szCs w:val="21"/>
-        </w:rPr>
-      </w:pPr>
-      <w:r>
-        <w:rPr>
-          <w:rFonts w:ascii="メイリオ" w:eastAsia="メイリオ" w:hAnsi="メイリオ" w:cs="メイリオ"/>
-          <w:sz w:val="21"/>
-          <w:szCs w:val="21"/>
-        </w:rPr>
-        <w:t>マーケティングのデータマネジメント、自動化、内製化を包括的に支援</w:t>
-      </w:r>
-    </w:p>
-    <w:p>
-      <w:pPr>
-        <w:widowControl w:val="0"/>
-        <w:numPr>
-          <w:ilvl w:val="0"/>
-          <w:numId w:val="8"/>
-        </w:numPr>
-        <w:spacing w:line="264" w:lineRule="auto"/>
-        <w:ind w:left="0" w:hanging="2"/>
-        <w:rPr>
-          <w:rFonts w:ascii="メイリオ" w:eastAsia="メイリオ" w:hAnsi="メイリオ" w:cs="メイリオ"/>
-          <w:sz w:val="21"/>
-          <w:szCs w:val="21"/>
-        </w:rPr>
-      </w:pPr>
-      <w:r>
-        <w:rPr>
-          <w:rFonts w:ascii="メイリオ" w:eastAsia="メイリオ" w:hAnsi="メイリオ" w:cs="メイリオ"/>
-          <w:b/>
-          <w:sz w:val="21"/>
-          <w:szCs w:val="21"/>
-        </w:rPr>
-        <w:t>プロジェクトマネジメントと新規事業推進</w:t>
-      </w:r>
-      <w:r>
-        <w:rPr>
-          <w:rFonts w:ascii="メイリオ" w:eastAsia="メイリオ" w:hAnsi="メイリオ" w:cs="メイリオ"/>
-          <w:sz w:val="21"/>
-          <w:szCs w:val="21"/>
-        </w:rPr>
-        <w:t>：</w:t>
-      </w:r>
-    </w:p>
-    <w:p>
-      <w:pPr>
-        <w:widowControl w:val="0"/>
-        <w:numPr>
-          <w:ilvl w:val="2"/>
-          <w:numId w:val="8"/>
-        </w:numPr>
-        <w:spacing w:line="264" w:lineRule="auto"/>
-        <w:ind w:leftChars="0" w:firstLineChars="0"/>
-        <w:rPr>
-          <w:rFonts w:ascii="メイリオ" w:eastAsia="メイリオ" w:hAnsi="メイリオ" w:cs="メイリオ"/>
-          <w:sz w:val="21"/>
-          <w:szCs w:val="21"/>
-        </w:rPr>
-      </w:pPr>
-      <w:r>
-        <w:rPr>
-          <w:rFonts w:ascii="メイリオ" w:eastAsia="メイリオ" w:hAnsi="メイリオ" w:cs="メイリオ"/>
-          <w:sz w:val="21"/>
-          <w:szCs w:val="21"/>
-        </w:rPr>
-        <w:t>大規模プロジェクト管理と新規事業の立ち上げ</w:t>
-      </w:r>
-    </w:p>
-    <w:p>
-      <w:pPr>
-        <w:widowControl w:val="0"/>
-        <w:numPr>
-          <w:ilvl w:val="2"/>
-          <w:numId w:val="8"/>
-        </w:numPr>
-        <w:spacing w:line="264" w:lineRule="auto"/>
-        <w:ind w:leftChars="0" w:firstLineChars="0"/>
-        <w:rPr>
-          <w:rFonts w:ascii="メイリオ" w:eastAsia="メイリオ" w:hAnsi="メイリオ" w:cs="メイリオ"/>
-          <w:sz w:val="21"/>
-          <w:szCs w:val="21"/>
-        </w:rPr>
-      </w:pPr>
-      <w:r>
-        <w:rPr>
-          <w:rFonts w:ascii="メイリオ" w:eastAsia="メイリオ" w:hAnsi="メイリオ" w:cs="メイリオ"/>
-          <w:sz w:val="21"/>
-          <w:szCs w:val="21"/>
-        </w:rPr>
-        <w:t>特にCDPプロジェクトの成功により企業のデータ活用を推進</w:t>
-      </w:r>
-    </w:p>
-    <w:p>
-      <w:pPr>
-        <w:widowControl w:val="0"/>
-        <w:numPr>
-          <w:ilvl w:val="0"/>
-          <w:numId w:val="8"/>
-        </w:numPr>
-        <w:spacing w:line="264" w:lineRule="auto"/>
-        <w:ind w:left="0" w:hanging="2"/>
-        <w:rPr>
-          <w:rFonts w:ascii="メイリオ" w:eastAsia="メイリオ" w:hAnsi="メイリオ" w:cs="メイリオ"/>
-          <w:sz w:val="21"/>
-          <w:szCs w:val="21"/>
-        </w:rPr>
-      </w:pPr>
-      <w:r>
-        <w:rPr>
-          <w:rFonts w:ascii="メイリオ" w:eastAsia="メイリオ" w:hAnsi="メイリオ" w:cs="メイリオ"/>
-          <w:b/>
-          <w:sz w:val="21"/>
-          <w:szCs w:val="21"/>
-        </w:rPr>
-        <w:t>生成AIとその応用</w:t>
-      </w:r>
-      <w:r>
-        <w:rPr>
-          <w:rFonts w:ascii="メイリオ" w:eastAsia="メイリオ" w:hAnsi="メイリオ" w:cs="メイリオ"/>
-          <w:sz w:val="21"/>
-          <w:szCs w:val="21"/>
-        </w:rPr>
-        <w:t>：</w:t>
-      </w:r>
-    </w:p>
-    <w:p>
-      <w:pPr>
-        <w:widowControl w:val="0"/>
-        <w:numPr>
-          <w:ilvl w:val="2"/>
-          <w:numId w:val="8"/>
-        </w:numPr>
-        <w:spacing w:line="264" w:lineRule="auto"/>
-        <w:ind w:leftChars="0" w:firstLineChars="0"/>
-        <w:rPr>
-          <w:rFonts w:ascii="メイリオ" w:eastAsia="メイリオ" w:hAnsi="メイリオ" w:cs="メイリオ"/>
-          <w:sz w:val="21"/>
-          <w:szCs w:val="21"/>
-        </w:rPr>
-      </w:pPr>
-      <w:r>
-        <w:rPr>
-          <w:rFonts w:ascii="メイリオ" w:eastAsia="メイリオ" w:hAnsi="メイリオ" w:cs="メイリオ"/>
-          <w:sz w:val="21"/>
-          <w:szCs w:val="21"/>
-        </w:rPr>
-        <w:t>生成AI、画像生成、共創型AIシステム開発の専門知識</w:t>
-      </w:r>
-    </w:p>
-    <w:p>
-      <w:pPr>
-        <w:widowControl w:val="0"/>
-        <w:numPr>
-          <w:ilvl w:val="2"/>
-          <w:numId w:val="8"/>
-        </w:numPr>
-        <w:spacing w:line="264" w:lineRule="auto"/>
-        <w:ind w:leftChars="0" w:firstLineChars="0"/>
-        <w:rPr>
-          <w:rFonts w:ascii="メイリオ" w:eastAsia="メイリオ" w:hAnsi="メイリオ" w:cs="メイリオ"/>
-          <w:sz w:val="21"/>
-          <w:szCs w:val="21"/>
-        </w:rPr>
-      </w:pPr>
-      <w:r>
-        <w:rPr>
-          <w:rFonts w:ascii="メイリオ" w:eastAsia="メイリオ" w:hAnsi="メイリオ" w:cs="メイリオ"/>
-          <w:sz w:val="21"/>
-          <w:szCs w:val="21"/>
-        </w:rPr>
-        <w:t>生成AIを活用した業務変革と新ソリューション開発をリード</w:t>
-      </w:r>
-    </w:p>
-    <w:p>
-      <w:pPr>
-        <w:widowControl w:val="0"/>
-        <w:numPr>
-          <w:ilvl w:val="2"/>
-          <w:numId w:val="8"/>
-        </w:numPr>
-        <w:spacing w:line="264" w:lineRule="auto"/>
-        <w:ind w:leftChars="0" w:firstLineChars="0"/>
-        <w:rPr>
-          <w:rFonts w:ascii="メイリオ" w:eastAsia="メイリオ" w:hAnsi="メイリオ" w:cs="メイリオ"/>
-          <w:sz w:val="21"/>
-          <w:szCs w:val="21"/>
-        </w:rPr>
-      </w:pPr>
-      <w:r>
-        <w:rPr>
-          <w:rFonts w:ascii="メイリオ" w:eastAsia="メイリオ" w:hAnsi="メイリオ" w:cs="メイリオ"/>
-          <w:sz w:val="21"/>
-          <w:szCs w:val="21"/>
-        </w:rPr>
-        <w:t>社内外の教育や推進活動を通じ、生成AIの普及を促進</w:t>
-      </w:r>
-    </w:p>
-    <w:p>
-      <w:pPr>
-        <w:widowControl w:val="0"/>
-        <w:numPr>
-          <w:ilvl w:val="0"/>
-          <w:numId w:val="8"/>
-        </w:numPr>
-        <w:spacing w:line="264" w:lineRule="auto"/>
-        <w:ind w:left="0" w:hanging="2"/>
-        <w:rPr>
-          <w:rFonts w:ascii="メイリオ" w:eastAsia="メイリオ" w:hAnsi="メイリオ" w:cs="メイリオ"/>
-          <w:sz w:val="21"/>
-          <w:szCs w:val="21"/>
-        </w:rPr>
-      </w:pPr>
-      <w:r>
-        <w:rPr>
-          <w:rFonts w:ascii="メイリオ" w:eastAsia="メイリオ" w:hAnsi="メイリオ" w:cs="メイリオ"/>
-          <w:b/>
-          <w:sz w:val="21"/>
-          <w:szCs w:val="21"/>
-        </w:rPr>
-        <w:lastRenderedPageBreak/>
-        <w:t>業界講演と</w:t>
-      </w:r>
-      <w:r>
-        <w:rPr>
-          <w:rFonts w:ascii="メイリオ" w:eastAsia="メイリオ" w:hAnsi="メイリオ" w:cs="メイリオ" w:hint="eastAsia"/>
-          <w:b/>
-          <w:sz w:val="21"/>
-          <w:szCs w:val="21"/>
-        </w:rPr>
-        <w:t>普及</w:t>
-      </w:r>
-      <w:r>
-        <w:rPr>
-          <w:rFonts w:ascii="メイリオ" w:eastAsia="メイリオ" w:hAnsi="メイリオ" w:cs="メイリオ"/>
-          <w:b/>
-          <w:sz w:val="21"/>
-          <w:szCs w:val="21"/>
-        </w:rPr>
-        <w:t>活動</w:t>
-      </w:r>
-      <w:r>
-        <w:rPr>
-          <w:rFonts w:ascii="メイリオ" w:eastAsia="メイリオ" w:hAnsi="メイリオ" w:cs="メイリオ"/>
-          <w:sz w:val="21"/>
-          <w:szCs w:val="21"/>
-        </w:rPr>
-        <w:t>：</w:t>
-      </w:r>
-    </w:p>
-    <w:p>
-      <w:pPr>
-        <w:widowControl w:val="0"/>
-        <w:numPr>
-          <w:ilvl w:val="2"/>
-          <w:numId w:val="8"/>
-        </w:numPr>
-        <w:spacing w:line="264" w:lineRule="auto"/>
-        <w:ind w:leftChars="0" w:firstLineChars="0"/>
-        <w:rPr>
-          <w:rFonts w:ascii="メイリオ" w:eastAsia="メイリオ" w:hAnsi="メイリオ" w:cs="メイリオ"/>
-          <w:sz w:val="21"/>
-          <w:szCs w:val="21"/>
-        </w:rPr>
-      </w:pPr>
-      <w:r>
-        <w:rPr>
-          <w:rFonts w:ascii="メイリオ" w:eastAsia="メイリオ" w:hAnsi="メイリオ" w:cs="メイリオ"/>
-          <w:sz w:val="21"/>
-          <w:szCs w:val="21"/>
-        </w:rPr>
-        <w:t>Google</w:t>
-      </w:r>
-      <w:r>
-        <w:rPr>
-          <w:rFonts w:ascii="メイリオ" w:eastAsia="メイリオ" w:hAnsi="メイリオ" w:cs="メイリオ" w:hint="eastAsia"/>
-          <w:sz w:val="21"/>
-          <w:szCs w:val="21"/>
-        </w:rPr>
-        <w:t>主催セミナー、</w:t>
-      </w:r>
-      <w:r>
-        <w:rPr>
-          <w:rFonts w:ascii="メイリオ" w:eastAsia="メイリオ" w:hAnsi="メイリオ" w:cs="メイリオ"/>
-          <w:sz w:val="21"/>
-          <w:szCs w:val="21"/>
-        </w:rPr>
-        <w:t>Ledge AI EXPO、広告業協同組合（ACA）</w:t>
-      </w:r>
-      <w:r>
-        <w:rPr>
-          <w:rFonts w:ascii="メイリオ" w:eastAsia="メイリオ" w:hAnsi="メイリオ" w:cs="メイリオ" w:hint="eastAsia"/>
-          <w:sz w:val="21"/>
-          <w:szCs w:val="21"/>
-        </w:rPr>
-        <w:t>、GUGA生成AI活用普及協会等</w:t>
-      </w:r>
-      <w:r>
-        <w:rPr>
-          <w:rFonts w:ascii="メイリオ" w:eastAsia="メイリオ" w:hAnsi="メイリオ" w:cs="メイリオ"/>
-          <w:sz w:val="21"/>
-          <w:szCs w:val="21"/>
-        </w:rPr>
-        <w:t>のセミナー登壇</w:t>
-      </w:r>
-    </w:p>
-    <w:p>
-      <w:pPr>
-        <w:widowControl w:val="0"/>
-        <w:numPr>
-          <w:ilvl w:val="0"/>
-          <w:numId w:val="8"/>
-        </w:numPr>
-        <w:spacing w:line="264" w:lineRule="auto"/>
-        <w:ind w:left="0" w:hanging="2"/>
-        <w:rPr>
-          <w:rFonts w:ascii="メイリオ" w:eastAsia="メイリオ" w:hAnsi="メイリオ" w:cs="メイリオ"/>
-          <w:sz w:val="21"/>
-          <w:szCs w:val="21"/>
-        </w:rPr>
-      </w:pPr>
-      <w:r>
-        <w:rPr>
-          <w:rFonts w:ascii="メイリオ" w:eastAsia="メイリオ" w:hAnsi="メイリオ" w:cs="メイリオ"/>
-          <w:b/>
-          <w:sz w:val="21"/>
-          <w:szCs w:val="21"/>
-        </w:rPr>
-        <w:t>パートナリングとネットワーク構築</w:t>
-      </w:r>
-      <w:r>
-        <w:rPr>
-          <w:rFonts w:ascii="メイリオ" w:eastAsia="メイリオ" w:hAnsi="メイリオ" w:cs="メイリオ"/>
-          <w:sz w:val="21"/>
-          <w:szCs w:val="21"/>
-        </w:rPr>
-        <w:t>：</w:t>
-      </w:r>
-    </w:p>
-    <w:p>
-      <w:pPr>
-        <w:widowControl w:val="0"/>
-        <w:numPr>
-          <w:ilvl w:val="2"/>
-          <w:numId w:val="8"/>
-        </w:numPr>
-        <w:spacing w:after="240" w:line="264" w:lineRule="auto"/>
-        <w:ind w:leftChars="0" w:firstLineChars="0"/>
-        <w:rPr>
-          <w:rFonts w:ascii="メイリオ" w:eastAsia="メイリオ" w:hAnsi="メイリオ" w:cs="メイリオ"/>
-          <w:sz w:val="21"/>
-          <w:szCs w:val="21"/>
-        </w:rPr>
-      </w:pPr>
-      <w:r>
-        <w:rPr>
-          <w:rFonts w:ascii="メイリオ" w:eastAsia="メイリオ" w:hAnsi="メイリオ" w:cs="メイリオ"/>
-          <w:sz w:val="21"/>
-          <w:szCs w:val="21"/>
-        </w:rPr>
-        <w:t>Google Cloudとのパートナリング推進、業界ネットワーク構築</w:t>
-      </w:r>
-    </w:p>
-    <w:p>
-      <w:pPr>
-        <w:widowControl w:val="0"/>
-        <w:spacing w:line="264" w:lineRule="auto"/>
-        <w:ind w:left="0" w:hanging="2"/>
-        <w:jc w:val="both"/>
-        <w:rPr>
-          <w:rFonts w:ascii="メイリオ" w:eastAsia="メイリオ" w:hAnsi="メイリオ" w:cs="メイリオ"/>
-          <w:sz w:val="21"/>
-          <w:szCs w:val="21"/>
-        </w:rPr>
-      </w:pPr>
-      <w:r>
-        <w:rPr>
-          <w:noProof/>
-          <w:sz w:val="18"/>
-          <w:szCs w:val="18"/>
-        </w:rPr>
-        <w:pict w14:anchorId="3CE8AC80">
-          <v:rect id="_x0000_i1026" alt="" style="width:425.2pt;height:.05pt;mso-width-percent:0;mso-height-percent:0;mso-width-percent:0;mso-height-percent:0" o:hralign="center" o:hrstd="t" o:hr="t" fillcolor="#a0a0a0" stroked="f"/>
-        </w:pict>
+      <w:r>
+        <w:rPr>
+          <w:b/>
+        </w:rPr>
+        <w:t>マーケティング｜マーケティング戦略・CRM</w:t>
+      </w:r>
+    </w:p>
+    <w:p>
+      <w:r>
+        <w:t>顧客理解とデータ分析をもとに、マーケティング戦略の策定からCRM施策の設計・実行・改善までを支援。</w:t>
+      </w:r>
+    </w:p>
+    <w:p>
+      <w:r>
+        <w:t>顧客コミュニケーションやオムニチャネル施策の設計、CRM体制・業務フローの整備を通じて、顧客体験（CX）の向上を推進。</w:t>
+      </w:r>
+    </w:p>
+    <w:p>
+      <w:r>
+        <w:rPr>
+          <w:b/>
+        </w:rPr>
+        <w:t>データ｜データ基盤構築・活用</w:t>
+      </w:r>
+    </w:p>
+    <w:p>
+      <w:r>
+        <w:t>CDP・BI・MAを活用し、顧客データの統合・可視化・分析から施策への活用までを包括的に支援。</w:t>
+      </w:r>
+    </w:p>
+    <w:p>
+      <w:r>
+        <w:t>データマネジメント、自動化、内製化を推進。プロジェクトマネジメントや新規事業の立ち上げ、組織づくりの経験を活かし、データ活用を実務に定着させる。</w:t>
+      </w:r>
+    </w:p>
+    <w:p>
+      <w:r>
+        <w:rPr>
+          <w:b/>
+        </w:rPr>
+        <w:t>AI｜生成AI・AIエージェント開発</w:t>
+      </w:r>
+    </w:p>
+    <w:p>
+      <w:r>
+        <w:t>生成AI・画像生成・共創型AIシステムの開発から、マーケティング実務を支援するAIエージェントの開発までを推進。</w:t>
+      </w:r>
+    </w:p>
+    <w:p>
+      <w:r>
+        <w:t>企画・要件整理から開発・品質確認・改善までをつなぎ、業務変革と新ソリューションの開発をリード。社内外の教育・講演を通じた普及にも取り組む。</w:t>
+      </w:r>
+    </w:p>
+    <w:p>
+      <w:r>
+        <w:t>関連経験として、Google Cloudとのパートナリング推進や業界ネットワーク構築にも携わる。</w:t>
       </w:r>
     </w:p>
     <w:p>
@@ -912,6 +516,47 @@
           <w:b/>
         </w:rPr>
         <w:t>これまでの職務経歴</w:t>
+      </w:r>
+    </w:p>
+    <w:p>
+      <w:r>
+        <w:rPr>
+          <w:b/>
+        </w:rPr>
+        <w:t>株式会社電通デジタル</w:t>
+      </w:r>
+    </w:p>
+    <w:p>
+      <w:r>
+        <w:t>2025年3月～現在</w:t>
+      </w:r>
+    </w:p>
+    <w:p>
+      <w:r>
+        <w:t>現在の主な担当：エージェントマネジメントリーダー／AI For Growth Marketing Agentsの開発推進</w:t>
+      </w:r>
+    </w:p>
+    <w:p>
+      <w:r>
+        <w:rPr>
+          <w:b/>
+        </w:rPr>
+        <w:t>業務詳細</w:t>
+      </w:r>
+    </w:p>
+    <w:p>
+      <w:r>
+        <w:t>2025年5月から電通における統合AIエージェントの開発リーダーとして推進。同年11月からマーケティング実務を支援する専門AIエージェントの開発を推進。</w:t>
+      </w:r>
+    </w:p>
+    <w:p>
+      <w:r>
+        <w:t>2026年2月に国内電通グループのAI開発センター（電通総研内）へ参画。2026年4月からエージェントマネジメントリーダーとして、AI For Growth Marketing Agentsの開発を推進。</w:t>
+      </w:r>
+    </w:p>
+    <w:p>
+      <w:r>
+        <w:t>専門家の知見をAIエージェントとして実装し、企画・要件整理、開発、品質確認、継続的な改善を担当。AIエージェント開発を支援する仕組みの整備にも取り組む。</w:t>
       </w:r>
     </w:p>
     <w:p>

</xml_diff>